<commit_message>
Week7: update laporan kelompok/individu dan PPT ke uji 3 jalur + spesifikasi sensor api
Co-Authored-By: Claude Sonnet 5.5 <noreply@anthropic.com>
Claude-Session: https://claude.ai/code/session_01EFAKZhib7CvMuWHfhRrZHZ
</commit_message>
<xml_diff>
--- a/Week7/Individu_LAPORAN PEKANAN.docx
+++ b/Week7/Individu_LAPORAN PEKANAN.docx
@@ -1345,7 +1345,7 @@
                 <w:sz w:val="20"/>
                 <w:szCs w:val="20"/>
               </w:rPr>
-              <w:t>Kode sender + receiver 20 jalur dan versi uji 5 jalur di repository</w:t>
+              <w:t>Kode sender + receiver 20 jalur, versi uji 5 jalur dan 3 jalur di repository</w:t>
             </w:r>
           </w:p>
         </w:tc>
@@ -1523,7 +1523,7 @@
                 <w:sz w:val="20"/>
                 <w:szCs w:val="20"/>
               </w:rPr>
-              <w:t>☑ Belum</w:t>
+              <w:t>☐ Belum</w:t>
             </w:r>
           </w:p>
         </w:tc>
@@ -1597,7 +1597,7 @@
                 <w:sz w:val="20"/>
                 <w:szCs w:val="20"/>
               </w:rPr>
-              <w:t>Menguji 5 jalur (sensor, Dijkstra, ESP-NOW, LED)</w:t>
+              <w:t>Menguji 3 jalur (sensor, Dijkstra, ESP-NOW, LED)</w:t>
             </w:r>
           </w:p>
         </w:tc>
@@ -1630,7 +1630,147 @@
                 <w:sz w:val="20"/>
                 <w:szCs w:val="20"/>
               </w:rPr>
-              <w:t>Hasil uji 5 jalur</w:t>
+              <w:t>Hasil uji 3 jalur</w:t>
+            </w:r>
+          </w:p>
+        </w:tc>
+        <w:tc>
+          <w:tcPr>
+            <w:tcW w:w="1300" w:type="dxa"/>
+            <w:tcBorders>
+              <w:top w:val="single" w:sz="6" w:space="0" w:color="E6E6E6"/>
+              <w:left w:val="single" w:sz="6" w:space="0" w:color="E6E6E6"/>
+              <w:bottom w:val="single" w:sz="6" w:space="0" w:color="E6E6E6"/>
+              <w:right w:val="single" w:sz="6" w:space="0" w:color="E6E6E6"/>
+            </w:tcBorders>
+            <w:vAlign w:val="center"/>
+            <w:hideMark/>
+          </w:tcPr>
+          <w:p>
+            <w:pPr>
+              <w:spacing w:after="0" w:line="240" w:lineRule="auto"/>
+              <w:rPr>
+                <w:rFonts w:ascii="Times New Roman" w:eastAsia="Times New Roman" w:hAnsi="Times New Roman" w:cs="Times New Roman"/>
+                <w:kern w:val="0"/>
+                <w:sz w:val="24"/>
+                <w:szCs w:val="24"/>
+                <w:lang w:eastAsia="en-ID"/>
+              </w:rPr>
+            </w:pPr>
+            <w:r>
+              <w:rPr>
+                <w:rFonts w:ascii="Segoe UI Symbol" w:eastAsia="Segoe UI Symbol" w:hAnsi="Segoe UI Symbol" w:cs="Segoe UI Symbol"/>
+                <w:sz w:val="20"/>
+                <w:szCs w:val="20"/>
+              </w:rPr>
+              <w:t>☑ Selesai</w:t>
+            </w:r>
+          </w:p>
+        </w:tc>
+      </w:tr>
+      <w:tr>
+        <w:trPr>
+          <w:cantSplit/>
+          <w:trHeight w:val="360"/>
+          <w:tblCellSpacing w:w="15" w:type="dxa"/>
+        </w:trPr>
+        <w:tc>
+          <w:tcPr>
+            <w:tcW w:w="600" w:type="dxa"/>
+            <w:tcBorders>
+              <w:top w:val="single" w:sz="6" w:space="0" w:color="E6E6E6"/>
+              <w:left w:val="single" w:sz="6" w:space="0" w:color="E6E6E6"/>
+              <w:bottom w:val="single" w:sz="6" w:space="0" w:color="E6E6E6"/>
+              <w:right w:val="single" w:sz="6" w:space="0" w:color="E6E6E6"/>
+            </w:tcBorders>
+            <w:vAlign w:val="center"/>
+            <w:hideMark/>
+          </w:tcPr>
+          <w:p>
+            <w:pPr>
+              <w:spacing w:after="0" w:line="240" w:lineRule="auto"/>
+              <w:jc w:val="center"/>
+              <w:rPr>
+                <w:rFonts w:ascii="Times New Roman" w:eastAsia="Times New Roman" w:hAnsi="Times New Roman" w:cs="Times New Roman"/>
+                <w:kern w:val="0"/>
+                <w:sz w:val="24"/>
+                <w:szCs w:val="24"/>
+                <w:lang w:eastAsia="en-ID"/>
+              </w:rPr>
+            </w:pPr>
+            <w:r>
+              <w:rPr>
+                <w:rFonts w:ascii="Times New Roman" w:eastAsia="Times New Roman" w:hAnsi="Times New Roman" w:cs="Times New Roman"/>
+                <w:sz w:val="20"/>
+                <w:szCs w:val="20"/>
+              </w:rPr>
+              <w:t>5</w:t>
+            </w:r>
+          </w:p>
+        </w:tc>
+        <w:tc>
+          <w:tcPr>
+            <w:tcW w:w="3900" w:type="dxa"/>
+            <w:tcBorders>
+              <w:top w:val="single" w:sz="6" w:space="0" w:color="E6E6E6"/>
+              <w:left w:val="single" w:sz="6" w:space="0" w:color="E6E6E6"/>
+              <w:bottom w:val="single" w:sz="6" w:space="0" w:color="E6E6E6"/>
+              <w:right w:val="single" w:sz="6" w:space="0" w:color="E6E6E6"/>
+            </w:tcBorders>
+            <w:vAlign w:val="center"/>
+            <w:hideMark/>
+          </w:tcPr>
+          <w:p>
+            <w:pPr>
+              <w:spacing w:after="0" w:line="240" w:lineRule="auto"/>
+              <w:rPr>
+                <w:rFonts w:ascii="Times New Roman" w:eastAsia="Times New Roman" w:hAnsi="Times New Roman" w:cs="Times New Roman"/>
+                <w:kern w:val="0"/>
+                <w:sz w:val="24"/>
+                <w:szCs w:val="24"/>
+                <w:lang w:eastAsia="en-ID"/>
+              </w:rPr>
+            </w:pPr>
+            <w:r>
+              <w:rPr>
+                <w:rFonts w:ascii="Times New Roman" w:eastAsia="Times New Roman" w:hAnsi="Times New Roman" w:cs="Times New Roman"/>
+                <w:sz w:val="20"/>
+                <w:szCs w:val="20"/>
+              </w:rPr>
+              <w:t>Mendokumentasikan spesifikasi sensor api</w:t>
+            </w:r>
+          </w:p>
+        </w:tc>
+        <w:tc>
+          <w:tcPr>
+            <w:tcW w:w="3200" w:type="dxa"/>
+            <w:tcBorders>
+              <w:top w:val="single" w:sz="6" w:space="0" w:color="E6E6E6"/>
+              <w:left w:val="single" w:sz="6" w:space="0" w:color="E6E6E6"/>
+              <w:bottom w:val="single" w:sz="6" w:space="0" w:color="E6E6E6"/>
+              <w:right w:val="single" w:sz="6" w:space="0" w:color="E6E6E6"/>
+            </w:tcBorders>
+            <w:vAlign w:val="center"/>
+            <w:hideMark/>
+          </w:tcPr>
+          <w:p>
+            <w:pPr>
+              <w:spacing w:after="0" w:line="240" w:lineRule="auto"/>
+              <w:rPr>
+                <w:rFonts w:ascii="Times New Roman" w:eastAsia="Times New Roman" w:hAnsi="Times New Roman" w:cs="Times New Roman"/>
+                <w:kern w:val="0"/>
+                <w:sz w:val="20"/>
+                <w:szCs w:val="20"/>
+                <w:lang w:eastAsia="en-ID"/>
+              </w:rPr>
+            </w:pPr>
+            <w:r>
+              <w:rPr>
+                <w:rFonts w:ascii="Times New Roman" w:eastAsia="Times New Roman" w:hAnsi="Times New Roman" w:cs="Times New Roman"/>
+                <w:sz w:val="20"/>
+                <w:szCs w:val="20"/>
+              </w:rPr>
+              <w:t>Tabel spesifikasi sensor di laporan</w:t>
             </w:r>
           </w:p>
         </w:tc>
@@ -2574,7 +2714,7 @@
                 <w:sz w:val="20"/>
                 <w:szCs w:val="20"/>
               </w:rPr>
-              <w:t>Kendala kabel PSU: power supply tidak bisa dipakai; merancang skenario uji 5 jalur</w:t>
+              <w:t>Kendala: arus uji 5 jalur kurang kuat dan konektor power supply bermasalah; memutuskan uji disederhanakan menjadi 3 jalur</w:t>
             </w:r>
           </w:p>
         </w:tc>
@@ -2719,7 +2859,7 @@
                 <w:sz w:val="20"/>
                 <w:szCs w:val="20"/>
               </w:rPr>
-              <w:t>Menulis dan menguji kode 5 jalur (sensor AO, ESP-NOW hemat paket, merah berkedip); menyusun laporan dan PPT</w:t>
+              <w:t>Menulis dan menguji kode 3 jalur (sensor AO GPIO 32/33/34, strip GPIO 5/13/14, ESP-NOW hemat paket, merah berkedip); menyusun spesifikasi sensor, laporan, dan PPT</w:t>
             </w:r>
           </w:p>
         </w:tc>
@@ -2789,7 +2929,7 @@
                 <w:sz w:val="20"/>
                 <w:szCs w:val="20"/>
               </w:rPr>
-              <w:t>Commit Week7/dijkstra_5jalur (Gambar 3); laporan</w:t>
+              <w:t>Commit Week7/dijkstra_3jalur (Gambar 3); laporan</w:t>
             </w:r>
           </w:p>
         </w:tc>
@@ -2989,7 +3129,7 @@
           <w:szCs w:val="21"/>
           <w:lang w:eastAsia="en-ID"/>
         </w:rPr>
-        <w:t>Menyusun versi uji 5 jalur (dijkstra_5jalur): Dijkstra pada peta lengkap, 5 strip fisik (34 LED), 5 sensor api via pin AO ADC1 dengan ambang 1500 / histeresis 1800, merah berkedip, dan ESP-NOW yang hanya mengirim saat ada perubahan.</w:t>
+        <w:t>Menyusun versi uji 5 jalur (dijkstra_5jalur) dan versi uji 3 jalur (dijkstra_3jalur): Dijkstra pada peta lengkap, 3 strip fisik (18 LED) pada GPIO 5, 13, 14, 3 sensor api via pin AO ADC1 (GPIO 32, 33, 34) dengan ambang 1500 / histeresis 1800, merah berkedip, dan ESP-NOW yang hanya mengirim saat ada perubahan.</w:t>
       </w:r>
     </w:p>
     <w:p>
@@ -3015,7 +3155,7 @@
           <w:szCs w:val="21"/>
           <w:lang w:eastAsia="en-ID"/>
         </w:rPr>
-        <w:t>Menguji 5 jalur karena power supply tidak bisa dipakai akibat kabel PSU; menyusun laporan dan PPT Pekan 7.</w:t>
+        <w:t>Menguji 3 jalur sampai berhasil (sensor hingga LED) setelah uji 5 jalur terkendala arus catu yang kurang kuat dan konektor power supply; mendokumentasikan spesifikasi sensor api; menyusun laporan dan PPT Pekan 7.</w:t>
       </w:r>
     </w:p>
     <w:p>
@@ -3073,7 +3213,7 @@
           <w:lang w:eastAsia="en-ID"/>
           <w14:ligatures w14:val="none"/>
         </w:rPr>
-        <w:t>Source code Week7/dijkstra_strip (20 jalur) dan Week7/dijkstra_5jalur (uji 5 jalur) di repository tim</w:t>
+        <w:t>Source code Week7/dijkstra_strip (20 jalur), Week7/dijkstra_5jalur, dan Week7/dijkstra_3jalur (uji 3 jalur berhasil) di repository tim</w:t>
       </w:r>
     </w:p>
     <w:p>
@@ -3126,6 +3266,32 @@
           <w:lang w:eastAsia="en-ID"/>
         </w:rPr>
         <w:t>README Week7: pemetaan pin, rangkaian, perkiraan daya, skenario uji</w:t>
+      </w:r>
+    </w:p>
+    <w:p>
+      <w:pPr>
+        <w:numPr>
+          <w:ilvl w:val="0"/>
+          <w:numId w:val="2"/>
+        </w:numPr>
+        <w:spacing w:before="100" w:beforeAutospacing="1" w:after="100" w:afterAutospacing="1" w:line="300" w:lineRule="atLeast"/>
+        <w:rPr>
+          <w:rFonts w:ascii="Segoe UI" w:eastAsia="Times New Roman" w:hAnsi="Segoe UI" w:cs="Segoe UI"/>
+          <w:kern w:val="0"/>
+          <w:sz w:val="21"/>
+          <w:szCs w:val="21"/>
+          <w:lang w:eastAsia="en-ID"/>
+        </w:rPr>
+      </w:pPr>
+      <w:r>
+        <w:rPr>
+          <w:rFonts w:ascii="Segoe UI" w:eastAsia="Times New Roman" w:hAnsi="Segoe UI" w:cs="Segoe UI"/>
+          <w:kern w:val="0"/>
+          <w:sz w:val="21"/>
+          <w:szCs w:val="21"/>
+          <w:lang w:eastAsia="en-ID"/>
+        </w:rPr>
+        <w:t>Spesifikasi sensor api (tabel pada bagian E laporan ini)</w:t>
       </w:r>
     </w:p>
     <w:p>
@@ -3556,7 +3722,7 @@
                 <w:sz w:val="20"/>
                 <w:szCs w:val="20"/>
               </w:rPr>
-              <w:t>LED strip 20 jalur selesai disolder; uji hanya 5 jalur karena kabel PSU</w:t>
+              <w:t>LED strip 20 jalur selesai disolder; rangkaian 3 jalur berhasil; uji 5 jalur terkendala arus; 20 jalur menunggu konektor PSU</w:t>
             </w:r>
           </w:p>
         </w:tc>
@@ -3700,7 +3866,7 @@
                 <w:sz w:val="20"/>
                 <w:szCs w:val="20"/>
               </w:rPr>
-              <w:t>Sender + receiver 20 jalur selesai; versi uji 5 jalur berjalan</w:t>
+              <w:t>Sender + receiver 20 jalur selesai; versi uji 3 jalur berhasil berjalan</w:t>
             </w:r>
           </w:p>
         </w:tc>
@@ -3844,7 +4010,7 @@
                 <w:sz w:val="20"/>
                 <w:szCs w:val="20"/>
               </w:rPr>
-              <w:t>Belum dipasang; menunggu uji penuh dengan PSU</w:t>
+              <w:t>LED dan sensor 3 jalur siap ditempel pada maket; menunggu penempelan</w:t>
             </w:r>
           </w:p>
         </w:tc>
@@ -3988,7 +4154,7 @@
                 <w:sz w:val="20"/>
                 <w:szCs w:val="20"/>
               </w:rPr>
-              <w:t>Hanya 5 jalur; 20 jalur menunggu kabel PSU</w:t>
+              <w:t>Uji 3 jalur berhasil; 20 jalur menunggu konektor PSU</w:t>
             </w:r>
           </w:p>
         </w:tc>
@@ -4224,9 +4390,963 @@
           <w:lang w:eastAsia="en-ID"/>
           <w14:ligatures w14:val="none"/>
         </w:rPr>
-        <w:t>Pekan ini LED strip selesai disolder dan kode prototipe penuh selesai serta di-scale ke 20 jalur. Karena kabel PSU tidak bisa dipakai, power supply belum dapat digunakan sehingga saya menyusun dan menguji versi 5 jalur (34 LED, 5 sensor) yang cukup dicatu USB laptop; pada 5 jalur sistem berjalan dari sensor hingga LED. Ini menyelesaikan sisi software dan hardware LED; sisa pekerjaan adalah uji 20 jalur dengan PSU, pemasangan pada maket, dan pengukuran daya.</w:t>
+        <w:t>Pekan ini LED strip selesai disolder dan kode prototipe penuh selesai serta di-scale ke 20 jalur. Uji 5 jalur terkendala karena arus catu kurang kuat dan konektor power supply bermasalah, sehingga pengujian disederhanakan menjadi 3 jalur (18 LED, 3 sensor): strip di GPIO 5, 13, 14 dan sensor AO di GPIO 32, 33, 34. Pada 3 jalur sistem berhasil berjalan dari sensor hingga LED. Sisa pekerjaan adalah menempel LED strip dan sensor 3 jalur pada maket, mengukur jarak deteksi sensor dan daya, serta uji 20 jalur setelah konektor PSU diperbaiki.</w:t>
       </w:r>
     </w:p>
+    <w:p>
+      <w:pPr>
+        <w:keepNext/>
+        <w:spacing w:before="100" w:beforeAutospacing="1" w:after="100" w:afterAutospacing="1" w:line="300" w:lineRule="atLeast"/>
+        <w:outlineLvl w:val="2"/>
+        <w:rPr>
+          <w:rFonts w:ascii="Segoe UI" w:eastAsia="Times New Roman" w:hAnsi="Segoe UI" w:cs="Segoe UI"/>
+          <w:b/>
+          <w:bCs/>
+          <w:kern w:val="0"/>
+          <w:sz w:val="27"/>
+          <w:szCs w:val="27"/>
+          <w:lang w:eastAsia="en-ID"/>
+          <w14:ligatures w14:val="none"/>
+        </w:rPr>
+      </w:pPr>
+      <w:r>
+        <w:rPr>
+          <w:rFonts w:ascii="Segoe UI" w:eastAsia="Times New Roman" w:hAnsi="Segoe UI" w:cs="Segoe UI"/>
+          <w:b/>
+          <w:bCs/>
+          <w:kern w:val="0"/>
+          <w:sz w:val="27"/>
+          <w:szCs w:val="27"/>
+          <w:lang w:eastAsia="en-ID"/>
+          <w14:ligatures w14:val="none"/>
+        </w:rPr>
+        <w:t>Spesifikasi Sensor Api</w:t>
+      </w:r>
+    </w:p>
+    <w:p>
+      <w:pPr>
+        <w:spacing w:before="100" w:beforeAutospacing="1" w:after="100" w:afterAutospacing="1" w:line="300" w:lineRule="atLeast"/>
+        <w:rPr>
+          <w:rFonts w:ascii="Segoe UI" w:eastAsia="Times New Roman" w:hAnsi="Segoe UI" w:cs="Segoe UI"/>
+          <w:kern w:val="0"/>
+          <w:sz w:val="21"/>
+          <w:szCs w:val="21"/>
+          <w:lang w:eastAsia="en-ID"/>
+          <w14:ligatures w14:val="none"/>
+        </w:rPr>
+      </w:pPr>
+      <w:r>
+        <w:rPr>
+          <w:rFonts w:ascii="Segoe UI" w:eastAsia="Times New Roman" w:hAnsi="Segoe UI" w:cs="Segoe UI"/>
+          <w:kern w:val="0"/>
+          <w:sz w:val="21"/>
+          <w:szCs w:val="21"/>
+          <w:lang w:eastAsia="en-ID"/>
+          <w14:ligatures w14:val="none"/>
+        </w:rPr>
+        <w:t>Sensor yang dipakai adalah modul flame sensor (LM393) dengan keluaran analog (AO). Nilai spesifikasi modul adalah tipikal datasheet; jarak deteksi aktual perlu diukur pada maket.</w:t>
+      </w:r>
+    </w:p>
+    <w:tbl>
+      <w:tblPr>
+        <w:tblW w:w="9065" w:type="dxa"/>
+        <w:tblCellSpacing w:w="15" w:type="dxa"/>
+        <w:tblCellMar>
+          <w:top w:w="15" w:type="dxa"/>
+          <w:left w:w="15" w:type="dxa"/>
+          <w:bottom w:w="15" w:type="dxa"/>
+          <w:right w:w="15" w:type="dxa"/>
+        </w:tblCellMar>
+        <w:tblLook w:val="04A0" w:firstRow="1" w:lastRow="0" w:firstColumn="1" w:lastColumn="0" w:noHBand="0" w:noVBand="1"/>
+      </w:tblPr>
+      <w:tblGrid>
+        <w:gridCol w:w="2969"/>
+        <w:gridCol w:w="6096"/>
+      </w:tblGrid>
+      <w:tr>
+        <w:trPr>
+          <w:trHeight w:val="368"/>
+          <w:tblHeader/>
+          <w:tblCellSpacing w:w="15" w:type="dxa"/>
+        </w:trPr>
+        <w:tc>
+          <w:tcPr>
+            <w:tcW w:w="2924" w:type="dxa"/>
+            <w:tcBorders>
+              <w:top w:val="single" w:sz="6" w:space="0" w:color="E6E6E6"/>
+              <w:left w:val="single" w:sz="6" w:space="0" w:color="E6E6E6"/>
+              <w:bottom w:val="single" w:sz="6" w:space="0" w:color="E6E6E6"/>
+              <w:right w:val="single" w:sz="6" w:space="0" w:color="E6E6E6"/>
+            </w:tcBorders>
+            <w:shd w:val="clear" w:color="auto" w:fill="F5F5F5"/>
+            <w:vAlign w:val="center"/>
+            <w:hideMark/>
+          </w:tcPr>
+          <w:p>
+            <w:pPr>
+              <w:spacing w:after="0" w:line="240" w:lineRule="auto"/>
+              <w:jc w:val="left"/>
+              <w:rPr>
+                <w:rFonts w:ascii="Times New Roman" w:eastAsia="Times New Roman" w:hAnsi="Times New Roman" w:cs="Times New Roman"/>
+                <w:b/>
+                <w:bCs/>
+                <w:kern w:val="0"/>
+                <w:sz w:val="24"/>
+                <w:szCs w:val="24"/>
+                <w:lang w:eastAsia="en-ID"/>
+                <w14:ligatures w14:val="none"/>
+              </w:rPr>
+            </w:pPr>
+            <w:r>
+              <w:rPr>
+                <w:rFonts w:ascii="Times New Roman" w:eastAsia="Times New Roman" w:hAnsi="Times New Roman" w:cs="Times New Roman"/>
+                <w:b/>
+                <w:bCs/>
+                <w:kern w:val="0"/>
+                <w:sz w:val="24"/>
+                <w:szCs w:val="24"/>
+                <w:lang w:eastAsia="en-ID"/>
+                <w14:ligatures w14:val="none"/>
+              </w:rPr>
+              <w:t>Parameter</w:t>
+            </w:r>
+          </w:p>
+        </w:tc>
+        <w:tc>
+          <w:tcPr>
+            <w:tcW w:w="6051" w:type="dxa"/>
+            <w:tcBorders>
+              <w:top w:val="single" w:sz="6" w:space="0" w:color="E6E6E6"/>
+              <w:left w:val="single" w:sz="6" w:space="0" w:color="E6E6E6"/>
+              <w:bottom w:val="single" w:sz="6" w:space="0" w:color="E6E6E6"/>
+              <w:right w:val="single" w:sz="6" w:space="0" w:color="E6E6E6"/>
+            </w:tcBorders>
+            <w:shd w:val="clear" w:color="auto" w:fill="F5F5F5"/>
+            <w:vAlign w:val="center"/>
+            <w:hideMark/>
+          </w:tcPr>
+          <w:p>
+            <w:pPr>
+              <w:spacing w:after="0" w:line="240" w:lineRule="auto"/>
+              <w:jc w:val="left"/>
+              <w:rPr>
+                <w:rFonts w:ascii="Times New Roman" w:eastAsia="Times New Roman" w:hAnsi="Times New Roman" w:cs="Times New Roman"/>
+                <w:b/>
+                <w:bCs/>
+                <w:kern w:val="0"/>
+                <w:sz w:val="24"/>
+                <w:szCs w:val="24"/>
+                <w:lang w:eastAsia="en-ID"/>
+                <w14:ligatures w14:val="none"/>
+              </w:rPr>
+            </w:pPr>
+            <w:r>
+              <w:rPr>
+                <w:rFonts w:ascii="Times New Roman" w:eastAsia="Times New Roman" w:hAnsi="Times New Roman" w:cs="Times New Roman"/>
+                <w:b/>
+                <w:bCs/>
+                <w:kern w:val="0"/>
+                <w:sz w:val="24"/>
+                <w:szCs w:val="24"/>
+                <w:lang w:eastAsia="en-ID"/>
+                <w14:ligatures w14:val="none"/>
+              </w:rPr>
+              <w:t>Spesifikasi</w:t>
+            </w:r>
+          </w:p>
+        </w:tc>
+      </w:tr>
+      <w:tr>
+        <w:trPr>
+          <w:trHeight w:val="368"/>
+          <w:tblCellSpacing w:w="15" w:type="dxa"/>
+        </w:trPr>
+        <w:tc>
+          <w:tcPr>
+            <w:tcW w:w="2924" w:type="dxa"/>
+            <w:tcBorders>
+              <w:top w:val="single" w:sz="6" w:space="0" w:color="E6E6E6"/>
+              <w:left w:val="single" w:sz="6" w:space="0" w:color="E6E6E6"/>
+              <w:bottom w:val="single" w:sz="6" w:space="0" w:color="E6E6E6"/>
+              <w:right w:val="single" w:sz="6" w:space="0" w:color="E6E6E6"/>
+            </w:tcBorders>
+            <w:vAlign w:val="center"/>
+            <w:hideMark/>
+          </w:tcPr>
+          <w:p>
+            <w:pPr>
+              <w:spacing w:after="0" w:line="240" w:lineRule="auto"/>
+              <w:jc w:val="left"/>
+              <w:rPr>
+                <w:rFonts w:ascii="Times New Roman" w:eastAsia="Times New Roman" w:hAnsi="Times New Roman" w:cs="Times New Roman"/>
+                <w:kern w:val="0"/>
+                <w:sz w:val="24"/>
+                <w:szCs w:val="24"/>
+                <w:lang w:eastAsia="en-ID"/>
+                <w14:ligatures w14:val="none"/>
+              </w:rPr>
+            </w:pPr>
+            <w:r>
+              <w:rPr>
+                <w:rFonts w:ascii="Times New Roman" w:eastAsia="Times New Roman" w:hAnsi="Times New Roman" w:cs="Times New Roman"/>
+                <w:kern w:val="0"/>
+                <w:sz w:val="24"/>
+                <w:szCs w:val="24"/>
+                <w:lang w:eastAsia="en-ID"/>
+                <w14:ligatures w14:val="none"/>
+              </w:rPr>
+              <w:t>Jenis modul</w:t>
+            </w:r>
+          </w:p>
+        </w:tc>
+        <w:tc>
+          <w:tcPr>
+            <w:tcW w:w="6051" w:type="dxa"/>
+            <w:tcBorders>
+              <w:top w:val="single" w:sz="6" w:space="0" w:color="E6E6E6"/>
+              <w:left w:val="single" w:sz="6" w:space="0" w:color="E6E6E6"/>
+              <w:bottom w:val="single" w:sz="6" w:space="0" w:color="E6E6E6"/>
+              <w:right w:val="single" w:sz="6" w:space="0" w:color="E6E6E6"/>
+            </w:tcBorders>
+            <w:vAlign w:val="center"/>
+            <w:hideMark/>
+          </w:tcPr>
+          <w:p>
+            <w:pPr>
+              <w:spacing w:after="0" w:line="240" w:lineRule="auto"/>
+              <w:jc w:val="left"/>
+              <w:rPr>
+                <w:rFonts w:ascii="Times New Roman" w:eastAsia="Times New Roman" w:hAnsi="Times New Roman" w:cs="Times New Roman"/>
+                <w:kern w:val="0"/>
+                <w:sz w:val="24"/>
+                <w:szCs w:val="24"/>
+                <w:lang w:eastAsia="en-ID"/>
+                <w14:ligatures w14:val="none"/>
+              </w:rPr>
+            </w:pPr>
+            <w:r>
+              <w:rPr>
+                <w:rFonts w:ascii="Times New Roman" w:eastAsia="Times New Roman" w:hAnsi="Times New Roman" w:cs="Times New Roman"/>
+                <w:sz w:val="24"/>
+                <w:szCs w:val="24"/>
+              </w:rPr>
+              <w:t>Modul flame sensor (fotodioda IR + komparator LM393). Keluaran analog (AO) dan digital (DO); yang dipakai: AO</w:t>
+            </w:r>
+          </w:p>
+        </w:tc>
+      </w:tr>
+      <w:tr>
+        <w:trPr>
+          <w:trHeight w:val="368"/>
+          <w:tblCellSpacing w:w="15" w:type="dxa"/>
+        </w:trPr>
+        <w:tc>
+          <w:tcPr>
+            <w:tcW w:w="2924" w:type="dxa"/>
+            <w:tcBorders>
+              <w:top w:val="single" w:sz="6" w:space="0" w:color="E6E6E6"/>
+              <w:left w:val="single" w:sz="6" w:space="0" w:color="E6E6E6"/>
+              <w:bottom w:val="single" w:sz="6" w:space="0" w:color="E6E6E6"/>
+              <w:right w:val="single" w:sz="6" w:space="0" w:color="E6E6E6"/>
+            </w:tcBorders>
+            <w:vAlign w:val="center"/>
+            <w:hideMark/>
+          </w:tcPr>
+          <w:p>
+            <w:pPr>
+              <w:spacing w:after="0" w:line="240" w:lineRule="auto"/>
+              <w:jc w:val="left"/>
+              <w:rPr>
+                <w:rFonts w:ascii="Times New Roman" w:eastAsia="Times New Roman" w:hAnsi="Times New Roman" w:cs="Times New Roman"/>
+                <w:kern w:val="0"/>
+                <w:sz w:val="24"/>
+                <w:szCs w:val="24"/>
+                <w:lang w:eastAsia="en-ID"/>
+                <w14:ligatures w14:val="none"/>
+              </w:rPr>
+            </w:pPr>
+            <w:r>
+              <w:rPr>
+                <w:rFonts w:ascii="Times New Roman" w:eastAsia="Times New Roman" w:hAnsi="Times New Roman" w:cs="Times New Roman"/>
+                <w:kern w:val="0"/>
+                <w:sz w:val="24"/>
+                <w:szCs w:val="24"/>
+                <w:lang w:eastAsia="en-ID"/>
+                <w14:ligatures w14:val="none"/>
+              </w:rPr>
+              <w:t>Spektrum cahaya</w:t>
+            </w:r>
+          </w:p>
+        </w:tc>
+        <w:tc>
+          <w:tcPr>
+            <w:tcW w:w="6051" w:type="dxa"/>
+            <w:tcBorders>
+              <w:top w:val="single" w:sz="6" w:space="0" w:color="E6E6E6"/>
+              <w:left w:val="single" w:sz="6" w:space="0" w:color="E6E6E6"/>
+              <w:bottom w:val="single" w:sz="6" w:space="0" w:color="E6E6E6"/>
+              <w:right w:val="single" w:sz="6" w:space="0" w:color="E6E6E6"/>
+            </w:tcBorders>
+            <w:vAlign w:val="center"/>
+            <w:hideMark/>
+          </w:tcPr>
+          <w:p>
+            <w:pPr>
+              <w:spacing w:after="0" w:line="240" w:lineRule="auto"/>
+              <w:jc w:val="left"/>
+              <w:rPr>
+                <w:rFonts w:ascii="Times New Roman" w:eastAsia="Times New Roman" w:hAnsi="Times New Roman" w:cs="Times New Roman"/>
+                <w:kern w:val="0"/>
+                <w:sz w:val="24"/>
+                <w:szCs w:val="24"/>
+                <w:lang w:eastAsia="en-ID"/>
+                <w14:ligatures w14:val="none"/>
+              </w:rPr>
+            </w:pPr>
+            <w:r>
+              <w:rPr>
+                <w:rFonts w:ascii="Times New Roman" w:eastAsia="Times New Roman" w:hAnsi="Times New Roman" w:cs="Times New Roman"/>
+                <w:sz w:val="24"/>
+                <w:szCs w:val="24"/>
+              </w:rPr>
+              <w:t>±760–1100 nm (inframerah dekat). Peka terhadap nyala api; juga peka IR matahari / lampu pijar</w:t>
+            </w:r>
+          </w:p>
+        </w:tc>
+      </w:tr>
+      <w:tr>
+        <w:trPr>
+          <w:trHeight w:val="368"/>
+          <w:tblCellSpacing w:w="15" w:type="dxa"/>
+        </w:trPr>
+        <w:tc>
+          <w:tcPr>
+            <w:tcW w:w="2924" w:type="dxa"/>
+            <w:tcBorders>
+              <w:top w:val="single" w:sz="6" w:space="0" w:color="E6E6E6"/>
+              <w:left w:val="single" w:sz="6" w:space="0" w:color="E6E6E6"/>
+              <w:bottom w:val="single" w:sz="6" w:space="0" w:color="E6E6E6"/>
+              <w:right w:val="single" w:sz="6" w:space="0" w:color="E6E6E6"/>
+            </w:tcBorders>
+            <w:vAlign w:val="center"/>
+            <w:hideMark/>
+          </w:tcPr>
+          <w:p>
+            <w:pPr>
+              <w:spacing w:after="0" w:line="240" w:lineRule="auto"/>
+              <w:jc w:val="left"/>
+              <w:rPr>
+                <w:rFonts w:ascii="Times New Roman" w:eastAsia="Times New Roman" w:hAnsi="Times New Roman" w:cs="Times New Roman"/>
+                <w:kern w:val="0"/>
+                <w:sz w:val="24"/>
+                <w:szCs w:val="24"/>
+                <w:lang w:eastAsia="en-ID"/>
+                <w14:ligatures w14:val="none"/>
+              </w:rPr>
+            </w:pPr>
+            <w:r>
+              <w:rPr>
+                <w:rFonts w:ascii="Times New Roman" w:eastAsia="Times New Roman" w:hAnsi="Times New Roman" w:cs="Times New Roman"/>
+                <w:kern w:val="0"/>
+                <w:sz w:val="24"/>
+                <w:szCs w:val="24"/>
+                <w:lang w:eastAsia="en-ID"/>
+                <w14:ligatures w14:val="none"/>
+              </w:rPr>
+              <w:t>Sudut deteksi</w:t>
+            </w:r>
+          </w:p>
+        </w:tc>
+        <w:tc>
+          <w:tcPr>
+            <w:tcW w:w="6051" w:type="dxa"/>
+            <w:tcBorders>
+              <w:top w:val="single" w:sz="6" w:space="0" w:color="E6E6E6"/>
+              <w:left w:val="single" w:sz="6" w:space="0" w:color="E6E6E6"/>
+              <w:bottom w:val="single" w:sz="6" w:space="0" w:color="E6E6E6"/>
+              <w:right w:val="single" w:sz="6" w:space="0" w:color="E6E6E6"/>
+            </w:tcBorders>
+            <w:vAlign w:val="center"/>
+            <w:hideMark/>
+          </w:tcPr>
+          <w:p>
+            <w:pPr>
+              <w:spacing w:after="0" w:line="240" w:lineRule="auto"/>
+              <w:jc w:val="left"/>
+              <w:rPr>
+                <w:rFonts w:ascii="Times New Roman" w:eastAsia="Times New Roman" w:hAnsi="Times New Roman" w:cs="Times New Roman"/>
+                <w:kern w:val="0"/>
+                <w:sz w:val="24"/>
+                <w:szCs w:val="24"/>
+                <w:lang w:eastAsia="en-ID"/>
+                <w14:ligatures w14:val="none"/>
+              </w:rPr>
+            </w:pPr>
+            <w:r>
+              <w:rPr>
+                <w:rFonts w:ascii="Times New Roman" w:eastAsia="Times New Roman" w:hAnsi="Times New Roman" w:cs="Times New Roman"/>
+                <w:sz w:val="24"/>
+                <w:szCs w:val="24"/>
+              </w:rPr>
+              <w:t>±60°. Modul diarahkan ke jalur yang dipantau</w:t>
+            </w:r>
+          </w:p>
+        </w:tc>
+      </w:tr>
+      <w:tr>
+        <w:trPr>
+          <w:trHeight w:val="368"/>
+          <w:tblCellSpacing w:w="15" w:type="dxa"/>
+        </w:trPr>
+        <w:tc>
+          <w:tcPr>
+            <w:tcW w:w="2924" w:type="dxa"/>
+            <w:tcBorders>
+              <w:top w:val="single" w:sz="6" w:space="0" w:color="E6E6E6"/>
+              <w:left w:val="single" w:sz="6" w:space="0" w:color="E6E6E6"/>
+              <w:bottom w:val="single" w:sz="6" w:space="0" w:color="E6E6E6"/>
+              <w:right w:val="single" w:sz="6" w:space="0" w:color="E6E6E6"/>
+            </w:tcBorders>
+            <w:vAlign w:val="center"/>
+            <w:hideMark/>
+          </w:tcPr>
+          <w:p>
+            <w:pPr>
+              <w:spacing w:after="0" w:line="240" w:lineRule="auto"/>
+              <w:jc w:val="left"/>
+              <w:rPr>
+                <w:rFonts w:ascii="Times New Roman" w:eastAsia="Times New Roman" w:hAnsi="Times New Roman" w:cs="Times New Roman"/>
+                <w:kern w:val="0"/>
+                <w:sz w:val="24"/>
+                <w:szCs w:val="24"/>
+                <w:lang w:eastAsia="en-ID"/>
+                <w14:ligatures w14:val="none"/>
+              </w:rPr>
+            </w:pPr>
+            <w:r>
+              <w:rPr>
+                <w:rFonts w:ascii="Times New Roman" w:eastAsia="Times New Roman" w:hAnsi="Times New Roman" w:cs="Times New Roman"/>
+                <w:kern w:val="0"/>
+                <w:sz w:val="24"/>
+                <w:szCs w:val="24"/>
+                <w:lang w:eastAsia="en-ID"/>
+                <w14:ligatures w14:val="none"/>
+              </w:rPr>
+              <w:t>Jarak deteksi</w:t>
+            </w:r>
+          </w:p>
+        </w:tc>
+        <w:tc>
+          <w:tcPr>
+            <w:tcW w:w="6051" w:type="dxa"/>
+            <w:tcBorders>
+              <w:top w:val="single" w:sz="6" w:space="0" w:color="E6E6E6"/>
+              <w:left w:val="single" w:sz="6" w:space="0" w:color="E6E6E6"/>
+              <w:bottom w:val="single" w:sz="6" w:space="0" w:color="E6E6E6"/>
+              <w:right w:val="single" w:sz="6" w:space="0" w:color="E6E6E6"/>
+            </w:tcBorders>
+            <w:vAlign w:val="center"/>
+            <w:hideMark/>
+          </w:tcPr>
+          <w:p>
+            <w:pPr>
+              <w:spacing w:after="0" w:line="240" w:lineRule="auto"/>
+              <w:jc w:val="left"/>
+              <w:rPr>
+                <w:rFonts w:ascii="Times New Roman" w:eastAsia="Times New Roman" w:hAnsi="Times New Roman" w:cs="Times New Roman"/>
+                <w:kern w:val="0"/>
+                <w:sz w:val="24"/>
+                <w:szCs w:val="24"/>
+                <w:lang w:eastAsia="en-ID"/>
+                <w14:ligatures w14:val="none"/>
+              </w:rPr>
+            </w:pPr>
+            <w:r>
+              <w:rPr>
+                <w:rFonts w:ascii="Times New Roman" w:eastAsia="Times New Roman" w:hAnsi="Times New Roman" w:cs="Times New Roman"/>
+                <w:sz w:val="24"/>
+                <w:szCs w:val="24"/>
+              </w:rPr>
+              <w:t>±20 cm (api korek) hingga ±80 cm (api lebih besar). Spesifikasi tipikal modul, diatur potensiometer (DO); bukan hasil ukur</w:t>
+            </w:r>
+          </w:p>
+        </w:tc>
+      </w:tr>
+      <w:tr>
+        <w:trPr>
+          <w:trHeight w:val="368"/>
+          <w:tblCellSpacing w:w="15" w:type="dxa"/>
+        </w:trPr>
+        <w:tc>
+          <w:tcPr>
+            <w:tcW w:w="2924" w:type="dxa"/>
+            <w:tcBorders>
+              <w:top w:val="single" w:sz="6" w:space="0" w:color="E6E6E6"/>
+              <w:left w:val="single" w:sz="6" w:space="0" w:color="E6E6E6"/>
+              <w:bottom w:val="single" w:sz="6" w:space="0" w:color="E6E6E6"/>
+              <w:right w:val="single" w:sz="6" w:space="0" w:color="E6E6E6"/>
+            </w:tcBorders>
+            <w:vAlign w:val="center"/>
+            <w:hideMark/>
+          </w:tcPr>
+          <w:p>
+            <w:pPr>
+              <w:spacing w:after="0" w:line="240" w:lineRule="auto"/>
+              <w:jc w:val="left"/>
+              <w:rPr>
+                <w:rFonts w:ascii="Times New Roman" w:eastAsia="Times New Roman" w:hAnsi="Times New Roman" w:cs="Times New Roman"/>
+                <w:kern w:val="0"/>
+                <w:sz w:val="24"/>
+                <w:szCs w:val="24"/>
+                <w:lang w:eastAsia="en-ID"/>
+                <w14:ligatures w14:val="none"/>
+              </w:rPr>
+            </w:pPr>
+            <w:r>
+              <w:rPr>
+                <w:rFonts w:ascii="Times New Roman" w:eastAsia="Times New Roman" w:hAnsi="Times New Roman" w:cs="Times New Roman"/>
+                <w:kern w:val="0"/>
+                <w:sz w:val="24"/>
+                <w:szCs w:val="24"/>
+                <w:lang w:eastAsia="en-ID"/>
+                <w14:ligatures w14:val="none"/>
+              </w:rPr>
+              <w:t>Tegangan kerja</w:t>
+            </w:r>
+          </w:p>
+        </w:tc>
+        <w:tc>
+          <w:tcPr>
+            <w:tcW w:w="6051" w:type="dxa"/>
+            <w:tcBorders>
+              <w:top w:val="single" w:sz="6" w:space="0" w:color="E6E6E6"/>
+              <w:left w:val="single" w:sz="6" w:space="0" w:color="E6E6E6"/>
+              <w:bottom w:val="single" w:sz="6" w:space="0" w:color="E6E6E6"/>
+              <w:right w:val="single" w:sz="6" w:space="0" w:color="E6E6E6"/>
+            </w:tcBorders>
+            <w:vAlign w:val="center"/>
+            <w:hideMark/>
+          </w:tcPr>
+          <w:p>
+            <w:pPr>
+              <w:spacing w:after="0" w:line="240" w:lineRule="auto"/>
+              <w:jc w:val="left"/>
+              <w:rPr>
+                <w:rFonts w:ascii="Times New Roman" w:eastAsia="Times New Roman" w:hAnsi="Times New Roman" w:cs="Times New Roman"/>
+                <w:kern w:val="0"/>
+                <w:sz w:val="24"/>
+                <w:szCs w:val="24"/>
+                <w:lang w:eastAsia="en-ID"/>
+                <w14:ligatures w14:val="none"/>
+              </w:rPr>
+            </w:pPr>
+            <w:r>
+              <w:rPr>
+                <w:rFonts w:ascii="Times New Roman" w:eastAsia="Times New Roman" w:hAnsi="Times New Roman" w:cs="Times New Roman"/>
+                <w:sz w:val="24"/>
+                <w:szCs w:val="24"/>
+              </w:rPr>
+              <w:t>3,3–5 V (dipakai 3,3 V). VCC 3,3 V agar AO tidak melebihi batas ADC ESP32</w:t>
+            </w:r>
+          </w:p>
+        </w:tc>
+      </w:tr>
+      <w:tr>
+        <w:trPr>
+          <w:trHeight w:val="368"/>
+          <w:tblCellSpacing w:w="15" w:type="dxa"/>
+        </w:trPr>
+        <w:tc>
+          <w:tcPr>
+            <w:tcW w:w="2924" w:type="dxa"/>
+            <w:tcBorders>
+              <w:top w:val="single" w:sz="6" w:space="0" w:color="E6E6E6"/>
+              <w:left w:val="single" w:sz="6" w:space="0" w:color="E6E6E6"/>
+              <w:bottom w:val="single" w:sz="6" w:space="0" w:color="E6E6E6"/>
+              <w:right w:val="single" w:sz="6" w:space="0" w:color="E6E6E6"/>
+            </w:tcBorders>
+            <w:vAlign w:val="center"/>
+            <w:hideMark/>
+          </w:tcPr>
+          <w:p>
+            <w:pPr>
+              <w:spacing w:after="0" w:line="240" w:lineRule="auto"/>
+              <w:jc w:val="left"/>
+              <w:rPr>
+                <w:rFonts w:ascii="Times New Roman" w:eastAsia="Times New Roman" w:hAnsi="Times New Roman" w:cs="Times New Roman"/>
+                <w:kern w:val="0"/>
+                <w:sz w:val="24"/>
+                <w:szCs w:val="24"/>
+                <w:lang w:eastAsia="en-ID"/>
+                <w14:ligatures w14:val="none"/>
+              </w:rPr>
+            </w:pPr>
+            <w:r>
+              <w:rPr>
+                <w:rFonts w:ascii="Times New Roman" w:eastAsia="Times New Roman" w:hAnsi="Times New Roman" w:cs="Times New Roman"/>
+                <w:kern w:val="0"/>
+                <w:sz w:val="24"/>
+                <w:szCs w:val="24"/>
+                <w:lang w:eastAsia="en-ID"/>
+                <w14:ligatures w14:val="none"/>
+              </w:rPr>
+              <w:t>Pin AO yang dipakai</w:t>
+            </w:r>
+          </w:p>
+        </w:tc>
+        <w:tc>
+          <w:tcPr>
+            <w:tcW w:w="6051" w:type="dxa"/>
+            <w:tcBorders>
+              <w:top w:val="single" w:sz="6" w:space="0" w:color="E6E6E6"/>
+              <w:left w:val="single" w:sz="6" w:space="0" w:color="E6E6E6"/>
+              <w:bottom w:val="single" w:sz="6" w:space="0" w:color="E6E6E6"/>
+              <w:right w:val="single" w:sz="6" w:space="0" w:color="E6E6E6"/>
+            </w:tcBorders>
+            <w:vAlign w:val="center"/>
+            <w:hideMark/>
+          </w:tcPr>
+          <w:p>
+            <w:pPr>
+              <w:spacing w:after="0" w:line="240" w:lineRule="auto"/>
+              <w:jc w:val="left"/>
+              <w:rPr>
+                <w:rFonts w:ascii="Times New Roman" w:eastAsia="Times New Roman" w:hAnsi="Times New Roman" w:cs="Times New Roman"/>
+                <w:kern w:val="0"/>
+                <w:sz w:val="24"/>
+                <w:szCs w:val="24"/>
+                <w:lang w:eastAsia="en-ID"/>
+                <w14:ligatures w14:val="none"/>
+              </w:rPr>
+            </w:pPr>
+            <w:r>
+              <w:rPr>
+                <w:rFonts w:ascii="Times New Roman" w:eastAsia="Times New Roman" w:hAnsi="Times New Roman" w:cs="Times New Roman"/>
+                <w:sz w:val="24"/>
+                <w:szCs w:val="24"/>
+              </w:rPr>
+              <w:t>GPIO 32, 33, 34 (ADC1). Sensor 1/2/3 = jalur #3 / #18 / #19; ADC2 tidak bisa dibaca saat ESP-NOW aktif</w:t>
+            </w:r>
+          </w:p>
+        </w:tc>
+      </w:tr>
+      <w:tr>
+        <w:trPr>
+          <w:trHeight w:val="368"/>
+          <w:tblCellSpacing w:w="15" w:type="dxa"/>
+        </w:trPr>
+        <w:tc>
+          <w:tcPr>
+            <w:tcW w:w="2924" w:type="dxa"/>
+            <w:tcBorders>
+              <w:top w:val="single" w:sz="6" w:space="0" w:color="E6E6E6"/>
+              <w:left w:val="single" w:sz="6" w:space="0" w:color="E6E6E6"/>
+              <w:bottom w:val="single" w:sz="6" w:space="0" w:color="E6E6E6"/>
+              <w:right w:val="single" w:sz="6" w:space="0" w:color="E6E6E6"/>
+            </w:tcBorders>
+            <w:vAlign w:val="center"/>
+            <w:hideMark/>
+          </w:tcPr>
+          <w:p>
+            <w:pPr>
+              <w:spacing w:after="0" w:line="240" w:lineRule="auto"/>
+              <w:jc w:val="left"/>
+              <w:rPr>
+                <w:rFonts w:ascii="Times New Roman" w:eastAsia="Times New Roman" w:hAnsi="Times New Roman" w:cs="Times New Roman"/>
+                <w:kern w:val="0"/>
+                <w:sz w:val="24"/>
+                <w:szCs w:val="24"/>
+                <w:lang w:eastAsia="en-ID"/>
+                <w14:ligatures w14:val="none"/>
+              </w:rPr>
+            </w:pPr>
+            <w:r>
+              <w:rPr>
+                <w:rFonts w:ascii="Times New Roman" w:eastAsia="Times New Roman" w:hAnsi="Times New Roman" w:cs="Times New Roman"/>
+                <w:kern w:val="0"/>
+                <w:sz w:val="24"/>
+                <w:szCs w:val="24"/>
+                <w:lang w:eastAsia="en-ID"/>
+                <w14:ligatures w14:val="none"/>
+              </w:rPr>
+              <w:t>Rentang scan ADC</w:t>
+            </w:r>
+          </w:p>
+        </w:tc>
+        <w:tc>
+          <w:tcPr>
+            <w:tcW w:w="6051" w:type="dxa"/>
+            <w:tcBorders>
+              <w:top w:val="single" w:sz="6" w:space="0" w:color="E6E6E6"/>
+              <w:left w:val="single" w:sz="6" w:space="0" w:color="E6E6E6"/>
+              <w:bottom w:val="single" w:sz="6" w:space="0" w:color="E6E6E6"/>
+              <w:right w:val="single" w:sz="6" w:space="0" w:color="E6E6E6"/>
+            </w:tcBorders>
+            <w:vAlign w:val="center"/>
+            <w:hideMark/>
+          </w:tcPr>
+          <w:p>
+            <w:pPr>
+              <w:spacing w:after="0" w:line="240" w:lineRule="auto"/>
+              <w:jc w:val="left"/>
+              <w:rPr>
+                <w:rFonts w:ascii="Times New Roman" w:eastAsia="Times New Roman" w:hAnsi="Times New Roman" w:cs="Times New Roman"/>
+                <w:kern w:val="0"/>
+                <w:sz w:val="24"/>
+                <w:szCs w:val="24"/>
+                <w:lang w:eastAsia="en-ID"/>
+                <w14:ligatures w14:val="none"/>
+              </w:rPr>
+            </w:pPr>
+            <w:r>
+              <w:rPr>
+                <w:rFonts w:ascii="Times New Roman" w:eastAsia="Times New Roman" w:hAnsi="Times New Roman" w:cs="Times New Roman"/>
+                <w:sz w:val="24"/>
+                <w:szCs w:val="24"/>
+              </w:rPr>
+              <w:t>0–4095 (12 bit), atenuasi 11 dB ≈ 0–3,3 V. Nilai ADC turun saat ada api (aktif rendah)</w:t>
+            </w:r>
+          </w:p>
+        </w:tc>
+      </w:tr>
+      <w:tr>
+        <w:trPr>
+          <w:trHeight w:val="368"/>
+          <w:tblCellSpacing w:w="15" w:type="dxa"/>
+        </w:trPr>
+        <w:tc>
+          <w:tcPr>
+            <w:tcW w:w="2924" w:type="dxa"/>
+            <w:tcBorders>
+              <w:top w:val="single" w:sz="6" w:space="0" w:color="E6E6E6"/>
+              <w:left w:val="single" w:sz="6" w:space="0" w:color="E6E6E6"/>
+              <w:bottom w:val="single" w:sz="6" w:space="0" w:color="E6E6E6"/>
+              <w:right w:val="single" w:sz="6" w:space="0" w:color="E6E6E6"/>
+            </w:tcBorders>
+            <w:vAlign w:val="center"/>
+            <w:hideMark/>
+          </w:tcPr>
+          <w:p>
+            <w:pPr>
+              <w:spacing w:after="0" w:line="240" w:lineRule="auto"/>
+              <w:jc w:val="left"/>
+              <w:rPr>
+                <w:rFonts w:ascii="Times New Roman" w:eastAsia="Times New Roman" w:hAnsi="Times New Roman" w:cs="Times New Roman"/>
+                <w:kern w:val="0"/>
+                <w:sz w:val="24"/>
+                <w:szCs w:val="24"/>
+                <w:lang w:eastAsia="en-ID"/>
+                <w14:ligatures w14:val="none"/>
+              </w:rPr>
+            </w:pPr>
+            <w:r>
+              <w:rPr>
+                <w:rFonts w:ascii="Times New Roman" w:eastAsia="Times New Roman" w:hAnsi="Times New Roman" w:cs="Times New Roman"/>
+                <w:kern w:val="0"/>
+                <w:sz w:val="24"/>
+                <w:szCs w:val="24"/>
+                <w:lang w:eastAsia="en-ID"/>
+                <w14:ligatures w14:val="none"/>
+              </w:rPr>
+              <w:t>Ambang deteksi</w:t>
+            </w:r>
+          </w:p>
+        </w:tc>
+        <w:tc>
+          <w:tcPr>
+            <w:tcW w:w="6051" w:type="dxa"/>
+            <w:tcBorders>
+              <w:top w:val="single" w:sz="6" w:space="0" w:color="E6E6E6"/>
+              <w:left w:val="single" w:sz="6" w:space="0" w:color="E6E6E6"/>
+              <w:bottom w:val="single" w:sz="6" w:space="0" w:color="E6E6E6"/>
+              <w:right w:val="single" w:sz="6" w:space="0" w:color="E6E6E6"/>
+            </w:tcBorders>
+            <w:vAlign w:val="center"/>
+            <w:hideMark/>
+          </w:tcPr>
+          <w:p>
+            <w:pPr>
+              <w:spacing w:after="0" w:line="240" w:lineRule="auto"/>
+              <w:jc w:val="left"/>
+              <w:rPr>
+                <w:rFonts w:ascii="Times New Roman" w:eastAsia="Times New Roman" w:hAnsi="Times New Roman" w:cs="Times New Roman"/>
+                <w:kern w:val="0"/>
+                <w:sz w:val="24"/>
+                <w:szCs w:val="24"/>
+                <w:lang w:eastAsia="en-ID"/>
+                <w14:ligatures w14:val="none"/>
+              </w:rPr>
+            </w:pPr>
+            <w:r>
+              <w:rPr>
+                <w:rFonts w:ascii="Times New Roman" w:eastAsia="Times New Roman" w:hAnsi="Times New Roman" w:cs="Times New Roman"/>
+                <w:sz w:val="24"/>
+                <w:szCs w:val="24"/>
+              </w:rPr>
+              <w:t>Api bila ADC &lt; 1500 (≈1,21 V); aman lagi bila &gt; 1800 (≈1,45 V). Histeresis 300 hitungan (≈0,24 V) agar tidak berkedip</w:t>
+            </w:r>
+          </w:p>
+        </w:tc>
+      </w:tr>
+      <w:tr>
+        <w:trPr>
+          <w:trHeight w:val="368"/>
+          <w:tblCellSpacing w:w="15" w:type="dxa"/>
+        </w:trPr>
+        <w:tc>
+          <w:tcPr>
+            <w:tcW w:w="2924" w:type="dxa"/>
+            <w:tcBorders>
+              <w:top w:val="single" w:sz="6" w:space="0" w:color="E6E6E6"/>
+              <w:left w:val="single" w:sz="6" w:space="0" w:color="E6E6E6"/>
+              <w:bottom w:val="single" w:sz="6" w:space="0" w:color="E6E6E6"/>
+              <w:right w:val="single" w:sz="6" w:space="0" w:color="E6E6E6"/>
+            </w:tcBorders>
+            <w:vAlign w:val="center"/>
+            <w:hideMark/>
+          </w:tcPr>
+          <w:p>
+            <w:pPr>
+              <w:spacing w:after="0" w:line="240" w:lineRule="auto"/>
+              <w:jc w:val="left"/>
+              <w:rPr>
+                <w:rFonts w:ascii="Times New Roman" w:eastAsia="Times New Roman" w:hAnsi="Times New Roman" w:cs="Times New Roman"/>
+                <w:kern w:val="0"/>
+                <w:sz w:val="24"/>
+                <w:szCs w:val="24"/>
+                <w:lang w:eastAsia="en-ID"/>
+                <w14:ligatures w14:val="none"/>
+              </w:rPr>
+            </w:pPr>
+            <w:r>
+              <w:rPr>
+                <w:rFonts w:ascii="Times New Roman" w:eastAsia="Times New Roman" w:hAnsi="Times New Roman" w:cs="Times New Roman"/>
+                <w:kern w:val="0"/>
+                <w:sz w:val="24"/>
+                <w:szCs w:val="24"/>
+                <w:lang w:eastAsia="en-ID"/>
+                <w14:ligatures w14:val="none"/>
+              </w:rPr>
+              <w:t>Periode scan</w:t>
+            </w:r>
+          </w:p>
+        </w:tc>
+        <w:tc>
+          <w:tcPr>
+            <w:tcW w:w="6051" w:type="dxa"/>
+            <w:tcBorders>
+              <w:top w:val="single" w:sz="6" w:space="0" w:color="E6E6E6"/>
+              <w:left w:val="single" w:sz="6" w:space="0" w:color="E6E6E6"/>
+              <w:bottom w:val="single" w:sz="6" w:space="0" w:color="E6E6E6"/>
+              <w:right w:val="single" w:sz="6" w:space="0" w:color="E6E6E6"/>
+            </w:tcBorders>
+            <w:vAlign w:val="center"/>
+            <w:hideMark/>
+          </w:tcPr>
+          <w:p>
+            <w:pPr>
+              <w:spacing w:after="0" w:line="240" w:lineRule="auto"/>
+              <w:jc w:val="left"/>
+              <w:rPr>
+                <w:rFonts w:ascii="Times New Roman" w:eastAsia="Times New Roman" w:hAnsi="Times New Roman" w:cs="Times New Roman"/>
+                <w:kern w:val="0"/>
+                <w:sz w:val="24"/>
+                <w:szCs w:val="24"/>
+                <w:lang w:eastAsia="en-ID"/>
+                <w14:ligatures w14:val="none"/>
+              </w:rPr>
+            </w:pPr>
+            <w:r>
+              <w:rPr>
+                <w:rFonts w:ascii="Times New Roman" w:eastAsia="Times New Roman" w:hAnsi="Times New Roman" w:cs="Times New Roman"/>
+                <w:sz w:val="24"/>
+                <w:szCs w:val="24"/>
+              </w:rPr>
+              <w:t>50 ms (20 Hz); rata-rata 8 sampel; konfirmasi 3 scan berturut-turut. Waktu deteksi ±150 ms ditambah kirim ESP-NOW (3x, jeda 100 ms); target ≤ 2 detik</w:t>
+            </w:r>
+          </w:p>
+        </w:tc>
+      </w:tr>
+      <w:tr>
+        <w:trPr>
+          <w:trHeight w:val="368"/>
+          <w:tblCellSpacing w:w="15" w:type="dxa"/>
+        </w:trPr>
+        <w:tc>
+          <w:tcPr>
+            <w:tcW w:w="2924" w:type="dxa"/>
+            <w:tcBorders>
+              <w:top w:val="single" w:sz="6" w:space="0" w:color="E6E6E6"/>
+              <w:left w:val="single" w:sz="6" w:space="0" w:color="E6E6E6"/>
+              <w:bottom w:val="single" w:sz="6" w:space="0" w:color="E6E6E6"/>
+              <w:right w:val="single" w:sz="6" w:space="0" w:color="E6E6E6"/>
+            </w:tcBorders>
+            <w:vAlign w:val="center"/>
+            <w:hideMark/>
+          </w:tcPr>
+          <w:p>
+            <w:pPr>
+              <w:spacing w:after="0" w:line="240" w:lineRule="auto"/>
+              <w:jc w:val="left"/>
+              <w:rPr>
+                <w:rFonts w:ascii="Times New Roman" w:eastAsia="Times New Roman" w:hAnsi="Times New Roman" w:cs="Times New Roman"/>
+                <w:kern w:val="0"/>
+                <w:sz w:val="24"/>
+                <w:szCs w:val="24"/>
+                <w:lang w:eastAsia="en-ID"/>
+                <w14:ligatures w14:val="none"/>
+              </w:rPr>
+            </w:pPr>
+            <w:r>
+              <w:rPr>
+                <w:rFonts w:ascii="Times New Roman" w:eastAsia="Times New Roman" w:hAnsi="Times New Roman" w:cs="Times New Roman"/>
+                <w:kern w:val="0"/>
+                <w:sz w:val="24"/>
+                <w:szCs w:val="24"/>
+                <w:lang w:eastAsia="en-ID"/>
+                <w14:ligatures w14:val="none"/>
+              </w:rPr>
+              <w:t>Jarak deteksi terukur</w:t>
+            </w:r>
+          </w:p>
+        </w:tc>
+        <w:tc>
+          <w:tcPr>
+            <w:tcW w:w="6051" w:type="dxa"/>
+            <w:tcBorders>
+              <w:top w:val="single" w:sz="6" w:space="0" w:color="E6E6E6"/>
+              <w:left w:val="single" w:sz="6" w:space="0" w:color="E6E6E6"/>
+              <w:bottom w:val="single" w:sz="6" w:space="0" w:color="E6E6E6"/>
+              <w:right w:val="single" w:sz="6" w:space="0" w:color="E6E6E6"/>
+            </w:tcBorders>
+            <w:vAlign w:val="center"/>
+            <w:hideMark/>
+          </w:tcPr>
+          <w:p>
+            <w:pPr>
+              <w:spacing w:after="0" w:line="240" w:lineRule="auto"/>
+              <w:jc w:val="left"/>
+              <w:rPr>
+                <w:rFonts w:ascii="Times New Roman" w:eastAsia="Times New Roman" w:hAnsi="Times New Roman" w:cs="Times New Roman"/>
+                <w:kern w:val="0"/>
+                <w:sz w:val="24"/>
+                <w:szCs w:val="24"/>
+                <w:lang w:eastAsia="en-ID"/>
+                <w14:ligatures w14:val="none"/>
+              </w:rPr>
+            </w:pPr>
+            <w:r>
+              <w:rPr>
+                <w:rFonts w:ascii="Times New Roman" w:eastAsia="Times New Roman" w:hAnsi="Times New Roman" w:cs="Times New Roman"/>
+                <w:sz w:val="24"/>
+                <w:szCs w:val="24"/>
+              </w:rPr>
+              <w:t>[isi hasil ukur pada maket: … cm]. Perlu diukur dengan api nyata; angka di atas adalah tipikal modul</w:t>
+            </w:r>
+          </w:p>
+        </w:tc>
+      </w:tr>
+    </w:tbl>
     <w:p>
       <w:pPr>
         <w:spacing w:after="0" w:line="300" w:lineRule="atLeast"/>
@@ -4552,7 +5672,7 @@
                 <w:sz w:val="20"/>
                 <w:szCs w:val="20"/>
               </w:rPr>
-              <w:t>Kabel catu daya (PSU) tidak bisa dipakai</w:t>
+              <w:t>Arus catu pada uji 5 jalur kurang kuat dan konektor power supply bermasalah</w:t>
             </w:r>
           </w:p>
         </w:tc>
@@ -4586,7 +5706,7 @@
                 <w:sz w:val="20"/>
                 <w:szCs w:val="20"/>
               </w:rPr>
-              <w:t>Power supply tidak dapat digunakan; pengujian hanya 5 jalur</w:t>
+              <w:t>5 jalur tidak dapat dicatu dengan baik; pengujian disederhanakan menjadi 3 jalur</w:t>
             </w:r>
           </w:p>
         </w:tc>
@@ -4697,7 +5817,7 @@
                 <w:sz w:val="20"/>
                 <w:szCs w:val="20"/>
               </w:rPr>
-              <w:t>Sensor api fisik hanya 5 jalur pada uji</w:t>
+              <w:t>Sensor api fisik hanya 3 jalur pada uji</w:t>
             </w:r>
           </w:p>
         </w:tc>
@@ -4964,7 +6084,7 @@
           <w:lang w:eastAsia="en-ID"/>
           <w14:ligatures w14:val="none"/>
         </w:rPr>
-        <w:t>Kabel PSU yang bermasalah menghalangi pemakaian power supply 5 V yang dibutuhkan 20 jalur (800 LED pada rancangan awal), sehingga seluruh jalur tidak dapat dicatu. Dengan hanya 5 jalur dan kecerahan 60/255, beban masih di bawah batas USB (±0,45 A), maka pengujian dialihkan ke 5 jalur. Pengujian 20 jalur tergantung perbaikan atau penggantian kabel PSU.</w:t>
+        <w:t>Arus catu pada uji 5 jalur kurang kuat dan konektor power supply bermasalah, sehingga 5 jalur (34 LED) dan 20 jalur tidak dapat dicatu dengan baik. Dengan 3 jalur (18 LED) dan kecerahan 60/255, beban lebih kecil (estimasi ±0,24 A) dan pengujian berhasil. Pengujian 20 jalur tergantung perbaikan atau penggantian konektor PSU.</w:t>
       </w:r>
     </w:p>
     <w:p>
@@ -5294,7 +6414,7 @@
                 <w:sz w:val="20"/>
                 <w:szCs w:val="20"/>
               </w:rPr>
-              <w:t>Perbaiki / ganti kabel PSU; uji 20 jalur dengan power supply 5 V dan ukur arus</w:t>
+              <w:t>Perbaiki / ganti konektor PSU; uji 20 jalur dengan power supply 5 V dan ukur arus</w:t>
             </w:r>
           </w:p>
         </w:tc>
@@ -5402,7 +6522,7 @@
                 <w:sz w:val="20"/>
                 <w:szCs w:val="20"/>
               </w:rPr>
-              <w:t>Sensor api hanya 5 jalur</w:t>
+              <w:t>Sensor api hanya 3 jalur</w:t>
             </w:r>
           </w:p>
         </w:tc>
@@ -5436,7 +6556,7 @@
                 <w:sz w:val="20"/>
                 <w:szCs w:val="20"/>
               </w:rPr>
-              <w:t>Simulasi lewat Serial; tambah sensor sesuai jumlah modul yang tersedia</w:t>
+              <w:t>Simulasi lewat Serial; tambah sensor sesuai jumlah modul yang tersedia; ukur jarak deteksi sensor di maket</w:t>
             </w:r>
           </w:p>
         </w:tc>
@@ -5755,7 +6875,7 @@
           <w:szCs w:val="21"/>
           <w:lang w:eastAsia="en-ID"/>
         </w:rPr>
-        <w:t>Foto pengujian 5 jalur (Gambar 2) [tempel foto]</w:t>
+        <w:t>Foto pengujian 3 jalur (Gambar 2) [tempel foto]</w:t>
       </w:r>
     </w:p>
     <w:p>
@@ -5781,7 +6901,7 @@
           <w:szCs w:val="21"/>
           <w:lang w:eastAsia="en-ID"/>
         </w:rPr>
-        <w:t>Source code Week7/dijkstra_5jalur dan Week7/dijkstra_strip (commit Git, repository tim)</w:t>
+        <w:t>Source code Week7/dijkstra_3jalur, Week7/dijkstra_5jalur, dan Week7/dijkstra_strip (commit Git, repository tim)</w:t>
       </w:r>
     </w:p>
     <w:tbl>
@@ -5820,7 +6940,7 @@
               <w:jc w:val="center"/>
             </w:pPr>
             <w:r>
-              <w:t>[Tempel foto: pengujian 5 jalur]</w:t>
+              <w:t>[Tempel foto: pengujian 3 jalur]</w:t>
             </w:r>
           </w:p>
         </w:tc>
@@ -5966,7 +7086,7 @@
           <w:lang w:eastAsia="en-ID"/>
           <w14:ligatures w14:val="none"/>
         </w:rPr>
-        <w:t>Diskusi teknis: pemetaan pin 20 strip dan 20 sensor, pilihan ADC1 untuk sensor, strategi uji 5 jalur karena kabel PSU, dan pembagian penyolderan</w:t>
+        <w:t>Diskusi teknis: pemetaan pin strip dan sensor, pilihan ADC1 untuk sensor, strategi uji 3 jalur karena arus catu dan konektor PSU, dan pembagian penyolderan</w:t>
       </w:r>
     </w:p>
     <w:p>
@@ -6369,27 +7489,27 @@
                 <w:sz w:val="20"/>
                 <w:szCs w:val="20"/>
               </w:rPr>
-              <w:t>Software: kode prototipe penuh dan scaling 20 jalur, versi uji 5 jalur, pengujian</w:t>
-            </w:r>
-          </w:p>
-          <w:p>
-            <w:pPr>
-              <w:spacing w:after="0" w:line="240" w:lineRule="auto"/>
-              <w:rPr>
-                <w:rFonts w:ascii="Times New Roman" w:eastAsia="Times New Roman" w:hAnsi="Times New Roman" w:cs="Times New Roman"/>
-                <w:kern w:val="0"/>
-                <w:sz w:val="24"/>
-                <w:szCs w:val="24"/>
-                <w:lang w:eastAsia="en-ID"/>
-              </w:rPr>
-            </w:pPr>
-            <w:r>
-              <w:rPr>
-                <w:rFonts w:ascii="Times New Roman" w:eastAsia="Times New Roman" w:hAnsi="Times New Roman" w:cs="Times New Roman"/>
-                <w:sz w:val="20"/>
-                <w:szCs w:val="20"/>
-              </w:rPr>
-              <w:t>Hardware: ikut menyolder LED; menyusun laporan pekanan dan PPT</w:t>
+              <w:t>Software: kode prototipe penuh dan scaling 20 jalur, versi uji 5 dan 3 jalur, pengujian</w:t>
+            </w:r>
+          </w:p>
+          <w:p>
+            <w:pPr>
+              <w:spacing w:after="0" w:line="240" w:lineRule="auto"/>
+              <w:rPr>
+                <w:rFonts w:ascii="Times New Roman" w:eastAsia="Times New Roman" w:hAnsi="Times New Roman" w:cs="Times New Roman"/>
+                <w:kern w:val="0"/>
+                <w:sz w:val="24"/>
+                <w:szCs w:val="24"/>
+                <w:lang w:eastAsia="en-ID"/>
+              </w:rPr>
+            </w:pPr>
+            <w:r>
+              <w:rPr>
+                <w:rFonts w:ascii="Times New Roman" w:eastAsia="Times New Roman" w:hAnsi="Times New Roman" w:cs="Times New Roman"/>
+                <w:sz w:val="20"/>
+                <w:szCs w:val="20"/>
+              </w:rPr>
+              <w:t>Hardware: ikut menyolder LED; menyusun laporan pekanan, spesifikasi sensor, dan PPT</w:t>
             </w:r>
           </w:p>
         </w:tc>
@@ -6849,27 +7969,27 @@
                 <w:sz w:val="20"/>
                 <w:szCs w:val="20"/>
               </w:rPr>
-              <w:t>Hardware: menyolder LED strip, merakit rangkaian sensor 5 jalur</w:t>
-            </w:r>
-          </w:p>
-          <w:p>
-            <w:pPr>
-              <w:spacing w:after="0" w:line="240" w:lineRule="auto"/>
-              <w:rPr>
-                <w:rFonts w:ascii="Times New Roman" w:eastAsia="Times New Roman" w:hAnsi="Times New Roman" w:cs="Times New Roman"/>
-                <w:kern w:val="0"/>
-                <w:sz w:val="24"/>
-                <w:szCs w:val="24"/>
-                <w:lang w:eastAsia="en-ID"/>
-              </w:rPr>
-            </w:pPr>
-            <w:r>
-              <w:rPr>
-                <w:rFonts w:ascii="Times New Roman" w:eastAsia="Times New Roman" w:hAnsi="Times New Roman" w:cs="Times New Roman"/>
-                <w:sz w:val="20"/>
-                <w:szCs w:val="20"/>
-              </w:rPr>
-              <w:t>Menelusuri kabel PSU</w:t>
+              <w:t>Hardware: menyolder LED strip, merakit rangkaian sensor 3 jalur</w:t>
+            </w:r>
+          </w:p>
+          <w:p>
+            <w:pPr>
+              <w:spacing w:after="0" w:line="240" w:lineRule="auto"/>
+              <w:rPr>
+                <w:rFonts w:ascii="Times New Roman" w:eastAsia="Times New Roman" w:hAnsi="Times New Roman" w:cs="Times New Roman"/>
+                <w:kern w:val="0"/>
+                <w:sz w:val="24"/>
+                <w:szCs w:val="24"/>
+                <w:lang w:eastAsia="en-ID"/>
+              </w:rPr>
+            </w:pPr>
+            <w:r>
+              <w:rPr>
+                <w:rFonts w:ascii="Times New Roman" w:eastAsia="Times New Roman" w:hAnsi="Times New Roman" w:cs="Times New Roman"/>
+                <w:sz w:val="20"/>
+                <w:szCs w:val="20"/>
+              </w:rPr>
+              <w:t>Menelusuri konektor PSU</w:t>
             </w:r>
           </w:p>
         </w:tc>
@@ -7029,7 +8149,7 @@
                 <w:sz w:val="20"/>
                 <w:szCs w:val="20"/>
               </w:rPr>
-              <w:t>Menelusuri kabel PSU</w:t>
+              <w:t>Menelusuri konektor PSU</w:t>
             </w:r>
           </w:p>
         </w:tc>
@@ -7174,7 +8294,7 @@
           <w:lang w:eastAsia="en-ID"/>
           <w14:ligatures w14:val="none"/>
         </w:rPr>
-        <w:t>Uji 5 jalur berhasil sehingga sistem tetap bisa didemonstrasikan walau PSU bermasalah</w:t>
+        <w:t>Uji 3 jalur berhasil dari sensor hingga LED sehingga sistem sudah bisa didemonstrasikan</w:t>
       </w:r>
     </w:p>
     <w:p>
@@ -7260,7 +8380,7 @@
           <w:lang w:eastAsia="en-ID"/>
           <w14:ligatures w14:val="none"/>
         </w:rPr>
-        <w:t>Kabel PSU tidak dicek lebih awal sehingga uji 20 jalur tertunda</w:t>
+        <w:t>Arus catu dan konektor PSU tidak dicek lebih awal sehingga uji 5 dan 20 jalur tertunda</w:t>
       </w:r>
     </w:p>
     <w:p>
@@ -7316,7 +8436,7 @@
           <w:lang w:eastAsia="en-ID"/>
           <w14:ligatures w14:val="none"/>
         </w:rPr>
-        <w:t>Sensor api fisik baru ada untuk 5 jalur</w:t>
+        <w:t>Sensor api fisik baru ada untuk 3 jalur; jarak deteksi belum diukur pada maket</w:t>
       </w:r>
     </w:p>
     <w:p>
@@ -7374,7 +8494,7 @@
           <w:lang w:eastAsia="en-ID"/>
           <w14:ligatures w14:val="none"/>
         </w:rPr>
-        <w:t>Catu daya dan kabelnya perlu dicek lebih awal, bukan setelah semua LED selesai disolder</w:t>
+        <w:t>Kebutuhan arus, catu daya, dan konektornya perlu dihitung dan dicek lebih awal, bukan setelah semua LED selesai disolder</w:t>
       </w:r>
     </w:p>
     <w:p>
@@ -7402,7 +8522,7 @@
           <w:lang w:eastAsia="en-ID"/>
           <w14:ligatures w14:val="none"/>
         </w:rPr>
-        <w:t>Pembagian uji bertahap (5 &gt; 10 &gt; 20 jalur) menjaga kemajuan saat hardware penuh belum siap</w:t>
+        <w:t>Pengurangan skala uji (20 &gt; 5 &gt; 3 jalur) menjaga kemajuan saat hardware penuh belum siap</w:t>
       </w:r>
     </w:p>
     <w:p>
@@ -7758,7 +8878,7 @@
                 <w:sz w:val="20"/>
                 <w:szCs w:val="20"/>
               </w:rPr>
-              <w:t>Perbaiki / ganti kabel PSU dan uji 20 jalur dengan power supply 5 V</w:t>
+              <w:t>Perbaiki / ganti konektor PSU dan uji 20 jalur dengan power supply 5 V</w:t>
             </w:r>
           </w:p>
         </w:tc>
@@ -7903,7 +9023,7 @@
                 <w:sz w:val="20"/>
                 <w:szCs w:val="20"/>
               </w:rPr>
-              <w:t>Kalibrasi ambang sensor dan ukur konsumsi daya</w:t>
+              <w:t>Kalibrasi ambang sensor, ukur jarak/sudut deteksi, dan ukur konsumsi daya</w:t>
             </w:r>
           </w:p>
         </w:tc>
@@ -7937,7 +9057,7 @@
                 <w:sz w:val="20"/>
                 <w:szCs w:val="20"/>
               </w:rPr>
-              <w:t>Tabel nilai ADC aman/api dan arus</w:t>
+              <w:t>Tabel nilai ADC aman/api, jarak deteksi, dan arus</w:t>
             </w:r>
           </w:p>
         </w:tc>
@@ -8048,7 +9168,7 @@
                 <w:sz w:val="20"/>
                 <w:szCs w:val="20"/>
               </w:rPr>
-              <w:t>Pasang LED strip dan sensor pada maket Gedung K</w:t>
+              <w:t>Tempel LED strip dan sensor 3 jalur pada maket Gedung K</w:t>
             </w:r>
           </w:p>
         </w:tc>
@@ -8082,7 +9202,7 @@
                 <w:sz w:val="20"/>
                 <w:szCs w:val="20"/>
               </w:rPr>
-              <w:t>Maket berfungsi dengan 20 jalur</w:t>
+              <w:t>Maket berfungsi dengan 3 jalur (tambah jalur bertahap)</w:t>
             </w:r>
           </w:p>
         </w:tc>

</xml_diff>

<commit_message>
fix: Week7 input api hanya dari sensor AO (ALLOW_TEXT_SIM 0), sesuaikan laporan, PPT, README
</commit_message>
<xml_diff>
--- a/Week7/Individu_LAPORAN PEKANAN.docx
+++ b/Week7/Individu_LAPORAN PEKANAN.docx
@@ -3129,7 +3129,7 @@
           <w:szCs w:val="21"/>
           <w:lang w:eastAsia="en-ID"/>
         </w:rPr>
-        <w:t>Menyusun versi uji 5 jalur (dijkstra_5jalur) dan versi uji 3 jalur (dijkstra_3jalur): Dijkstra pada peta lengkap, 3 strip fisik (18 LED) pada GPIO 5, 13, 14, 3 sensor api via pin AO ADC1 (GPIO 32, 33, 34) dengan ambang 1500 / histeresis 1800, merah berkedip, dan ESP-NOW yang hanya mengirim saat ada perubahan.</w:t>
+        <w:t>Menyusun versi uji 5 jalur (dijkstra_5jalur) dan versi uji 3 jalur (dijkstra_3jalur): Dijkstra pada peta lengkap, 3 strip fisik (18 LED) pada GPIO 5, 13, 14, 3 sensor api via pin AO ADC1 (GPIO 32, 33, 34) dengan ambang 1500 / histeresis 1800, merah berkedip, dan ESP-NOW yang hanya mengirim saat ada perubahan. Input api hanya dari sensor AO (simulasi teks dimatikan).</w:t>
       </w:r>
     </w:p>
     <w:p>
@@ -5851,7 +5851,7 @@
                 <w:sz w:val="20"/>
                 <w:szCs w:val="20"/>
               </w:rPr>
-              <w:t>Jalur lain hanya disimulasikan lewat Serial</w:t>
+              <w:t>Hanya 3 jalur yang dapat mendeteksi api; jalur lain tidak pernah dianggap kena api (simulasi teks dimatikan)</w:t>
             </w:r>
           </w:p>
         </w:tc>
@@ -6556,7 +6556,7 @@
                 <w:sz w:val="20"/>
                 <w:szCs w:val="20"/>
               </w:rPr>
-              <w:t>Simulasi lewat Serial; tambah sensor sesuai jumlah modul yang tersedia; ukur jarak deteksi sensor di maket</w:t>
+              <w:t>Input api hanya dari sensor AO; tambah sensor sesuai jumlah modul yang tersedia; ukur jarak deteksi sensor di maket</w:t>
             </w:r>
           </w:p>
         </w:tc>

</xml_diff>